<commit_message>
cập nhật toàn bộ
</commit_message>
<xml_diff>
--- a/Docs/QA-Testing/Test_Summary_Report.docx
+++ b/Docs/QA-Testing/Test_Summary_Report.docx
@@ -4,67 +4,1250 @@
   <w:body>
     <w:p>
       <w:pPr>
+        <w:pBdr>
+          <w:top w:val="thickThinSmallGap" w:sz="24" w:space="1" w:color="auto"/>
+          <w:left w:val="thickThinSmallGap" w:sz="24" w:space="4" w:color="auto"/>
+          <w:bottom w:val="thinThickSmallGap" w:sz="24" w:space="31" w:color="auto"/>
+          <w:right w:val="thinThickSmallGap" w:sz="24" w:space="4" w:color="auto"/>
+        </w:pBdr>
+        <w:tabs>
+          <w:tab w:val="left" w:pos="7371"/>
+        </w:tabs>
+        <w:jc w:val="center"/>
         <w:rPr>
           <w:rFonts w:ascii="Times New Roman" w:hAnsi="Times New Roman" w:cs="Times New Roman"/>
           <w:b/>
-          <w:sz w:val="26"/>
-          <w:szCs w:val="26"/>
+          <w:bCs/>
+          <w:sz w:val="28"/>
+          <w:szCs w:val="28"/>
         </w:rPr>
       </w:pPr>
       <w:r>
         <w:rPr>
           <w:rFonts w:ascii="Times New Roman" w:hAnsi="Times New Roman" w:cs="Times New Roman"/>
           <w:b/>
-          <w:sz w:val="26"/>
-          <w:szCs w:val="26"/>
-        </w:rPr>
-        <w:t>TEST SUMMARY REPORT</w:t>
-      </w:r>
-    </w:p>
-    <w:p>
-      <w:pPr>
+          <w:bCs/>
+          <w:sz w:val="28"/>
+          <w:szCs w:val="28"/>
+        </w:rPr>
+        <w:t xml:space="preserve">TRƯỜNG ĐẠI HỌC GIAO THÔNG VẬN TẢI TP.HỒ CHÍ MINH </w:t>
+      </w:r>
+    </w:p>
+    <w:p>
+      <w:pPr>
+        <w:pBdr>
+          <w:top w:val="thickThinSmallGap" w:sz="24" w:space="1" w:color="auto"/>
+          <w:left w:val="thickThinSmallGap" w:sz="24" w:space="4" w:color="auto"/>
+          <w:bottom w:val="thinThickSmallGap" w:sz="24" w:space="31" w:color="auto"/>
+          <w:right w:val="thinThickSmallGap" w:sz="24" w:space="4" w:color="auto"/>
+        </w:pBdr>
+        <w:jc w:val="center"/>
         <w:rPr>
           <w:rFonts w:ascii="Times New Roman" w:hAnsi="Times New Roman" w:cs="Times New Roman"/>
           <w:b/>
-          <w:sz w:val="26"/>
-          <w:szCs w:val="26"/>
+          <w:bCs/>
+          <w:sz w:val="28"/>
+          <w:szCs w:val="28"/>
         </w:rPr>
       </w:pPr>
       <w:r>
         <w:rPr>
           <w:rFonts w:ascii="Times New Roman" w:hAnsi="Times New Roman" w:cs="Times New Roman"/>
           <w:b/>
-          <w:sz w:val="26"/>
-          <w:szCs w:val="26"/>
-        </w:rPr>
-        <w:t>Online Shopping Store — Kiểm chứng phần mềm</w:t>
-      </w:r>
-    </w:p>
-    <w:p>
-      <w:pPr>
-        <w:rPr>
-          <w:rFonts w:ascii="Times New Roman" w:hAnsi="Times New Roman" w:cs="Times New Roman"/>
-          <w:sz w:val="26"/>
-          <w:szCs w:val="26"/>
-        </w:rPr>
-      </w:pPr>
-      <w:r>
+          <w:bCs/>
+          <w:sz w:val="28"/>
+          <w:szCs w:val="28"/>
+        </w:rPr>
+        <w:t>KHOA CÔNG NGHỆ THÔNG TIN</w:t>
+      </w:r>
+    </w:p>
+    <w:p>
+      <w:pPr>
+        <w:pBdr>
+          <w:top w:val="thickThinSmallGap" w:sz="24" w:space="1" w:color="auto"/>
+          <w:left w:val="thickThinSmallGap" w:sz="24" w:space="4" w:color="auto"/>
+          <w:bottom w:val="thinThickSmallGap" w:sz="24" w:space="31" w:color="auto"/>
+          <w:right w:val="thinThickSmallGap" w:sz="24" w:space="4" w:color="auto"/>
+        </w:pBdr>
+        <w:jc w:val="center"/>
         <w:rPr>
           <w:rFonts w:ascii="Times New Roman" w:hAnsi="Times New Roman" w:cs="Times New Roman"/>
           <w:b/>
-          <w:sz w:val="26"/>
-          <w:szCs w:val="26"/>
-        </w:rPr>
-        <w:t>File này CHỈ điền ở Tuần 4</w:t>
-      </w:r>
-      <w:r>
-        <w:rPr>
-          <w:rFonts w:ascii="Times New Roman" w:hAnsi="Times New Roman" w:cs="Times New Roman"/>
-          <w:sz w:val="26"/>
-          <w:szCs w:val="26"/>
-        </w:rPr>
-        <w:t xml:space="preserve">, sau khi đã có đủ dữ liệu từ Test_Execution_Report_FE.xlsx, Test_Execution_Report_API.xlsx, Bug_Report.xlsx. </w:t>
-      </w:r>
+          <w:bCs/>
+          <w:sz w:val="28"/>
+          <w:szCs w:val="28"/>
+        </w:rPr>
+      </w:pPr>
+    </w:p>
+    <w:p>
+      <w:pPr>
+        <w:pBdr>
+          <w:top w:val="thickThinSmallGap" w:sz="24" w:space="1" w:color="auto"/>
+          <w:left w:val="thickThinSmallGap" w:sz="24" w:space="4" w:color="auto"/>
+          <w:bottom w:val="thinThickSmallGap" w:sz="24" w:space="31" w:color="auto"/>
+          <w:right w:val="thinThickSmallGap" w:sz="24" w:space="4" w:color="auto"/>
+        </w:pBdr>
+        <w:jc w:val="center"/>
+        <w:rPr>
+          <w:rFonts w:ascii="Times New Roman" w:hAnsi="Times New Roman" w:cs="Times New Roman"/>
+          <w:b/>
+          <w:bCs/>
+          <w:sz w:val="28"/>
+          <w:szCs w:val="28"/>
+        </w:rPr>
+      </w:pPr>
+    </w:p>
+    <w:p>
+      <w:pPr>
+        <w:pBdr>
+          <w:top w:val="thickThinSmallGap" w:sz="24" w:space="1" w:color="auto"/>
+          <w:left w:val="thickThinSmallGap" w:sz="24" w:space="4" w:color="auto"/>
+          <w:bottom w:val="thinThickSmallGap" w:sz="24" w:space="31" w:color="auto"/>
+          <w:right w:val="thinThickSmallGap" w:sz="24" w:space="4" w:color="auto"/>
+        </w:pBdr>
+        <w:jc w:val="center"/>
+        <w:rPr>
+          <w:rFonts w:ascii="Times New Roman" w:hAnsi="Times New Roman" w:cs="Times New Roman"/>
+          <w:noProof/>
+          <w:szCs w:val="24"/>
+        </w:rPr>
+      </w:pPr>
+    </w:p>
+    <w:p>
+      <w:pPr>
+        <w:pBdr>
+          <w:top w:val="thickThinSmallGap" w:sz="24" w:space="1" w:color="auto"/>
+          <w:left w:val="thickThinSmallGap" w:sz="24" w:space="4" w:color="auto"/>
+          <w:bottom w:val="thinThickSmallGap" w:sz="24" w:space="31" w:color="auto"/>
+          <w:right w:val="thinThickSmallGap" w:sz="24" w:space="4" w:color="auto"/>
+        </w:pBdr>
+        <w:jc w:val="center"/>
+        <w:rPr>
+          <w:rFonts w:ascii="Times New Roman" w:hAnsi="Times New Roman" w:cs="Times New Roman"/>
+          <w:b/>
+          <w:bCs/>
+          <w:sz w:val="28"/>
+          <w:szCs w:val="28"/>
+        </w:rPr>
+      </w:pPr>
+      <w:r>
+        <w:rPr>
+          <w:rFonts w:ascii="Times New Roman" w:hAnsi="Times New Roman" w:cs="Times New Roman"/>
+          <w:noProof/>
+          <w:szCs w:val="24"/>
+        </w:rPr>
+        <w:drawing>
+          <wp:inline distT="0" distB="0" distL="0" distR="0" wp14:anchorId="2954532E" wp14:editId="2307CA0E">
+            <wp:extent cx="3873500" cy="1082289"/>
+            <wp:effectExtent l="0" t="0" r="0" b="3810"/>
+            <wp:docPr id="3" name="Picture 3"/>
+            <wp:cNvGraphicFramePr>
+              <a:graphicFrameLocks xmlns:a="http://schemas.openxmlformats.org/drawingml/2006/main" noChangeAspect="1"/>
+            </wp:cNvGraphicFramePr>
+            <a:graphic xmlns:a="http://schemas.openxmlformats.org/drawingml/2006/main">
+              <a:graphicData uri="http://schemas.openxmlformats.org/drawingml/2006/picture">
+                <pic:pic xmlns:pic="http://schemas.openxmlformats.org/drawingml/2006/picture">
+                  <pic:nvPicPr>
+                    <pic:cNvPr id="4" name="Picture 4"/>
+                    <pic:cNvPicPr>
+                      <a:picLocks noChangeAspect="1" noChangeArrowheads="1"/>
+                    </pic:cNvPicPr>
+                  </pic:nvPicPr>
+                  <pic:blipFill>
+                    <a:blip r:embed="rId8">
+                      <a:extLst>
+                        <a:ext uri="{28A0092B-C50C-407E-A947-70E740481C1C}">
+                          <a14:useLocalDpi xmlns:a14="http://schemas.microsoft.com/office/drawing/2010/main" val="0"/>
+                        </a:ext>
+                      </a:extLst>
+                    </a:blip>
+                    <a:srcRect/>
+                    <a:stretch>
+                      <a:fillRect/>
+                    </a:stretch>
+                  </pic:blipFill>
+                  <pic:spPr>
+                    <a:xfrm>
+                      <a:off x="0" y="0"/>
+                      <a:ext cx="3939218" cy="1100651"/>
+                    </a:xfrm>
+                    <a:prstGeom prst="rect">
+                      <a:avLst/>
+                    </a:prstGeom>
+                    <a:noFill/>
+                    <a:ln>
+                      <a:noFill/>
+                    </a:ln>
+                  </pic:spPr>
+                </pic:pic>
+              </a:graphicData>
+            </a:graphic>
+          </wp:inline>
+        </w:drawing>
+      </w:r>
+    </w:p>
+    <w:p>
+      <w:pPr>
+        <w:pBdr>
+          <w:top w:val="thickThinSmallGap" w:sz="24" w:space="1" w:color="auto"/>
+          <w:left w:val="thickThinSmallGap" w:sz="24" w:space="4" w:color="auto"/>
+          <w:bottom w:val="thinThickSmallGap" w:sz="24" w:space="31" w:color="auto"/>
+          <w:right w:val="thinThickSmallGap" w:sz="24" w:space="4" w:color="auto"/>
+        </w:pBdr>
+        <w:jc w:val="center"/>
+        <w:rPr>
+          <w:rFonts w:ascii="Times New Roman" w:hAnsi="Times New Roman" w:cs="Times New Roman"/>
+          <w:b/>
+          <w:bCs/>
+          <w:sz w:val="36"/>
+          <w:szCs w:val="36"/>
+        </w:rPr>
+      </w:pPr>
+    </w:p>
+    <w:p>
+      <w:pPr>
+        <w:pBdr>
+          <w:top w:val="thickThinSmallGap" w:sz="24" w:space="1" w:color="auto"/>
+          <w:left w:val="thickThinSmallGap" w:sz="24" w:space="4" w:color="auto"/>
+          <w:bottom w:val="thinThickSmallGap" w:sz="24" w:space="31" w:color="auto"/>
+          <w:right w:val="thinThickSmallGap" w:sz="24" w:space="4" w:color="auto"/>
+        </w:pBdr>
+        <w:jc w:val="center"/>
+        <w:rPr>
+          <w:rFonts w:ascii="Times New Roman" w:hAnsi="Times New Roman" w:cs="Times New Roman"/>
+          <w:b/>
+          <w:bCs/>
+          <w:sz w:val="36"/>
+          <w:szCs w:val="36"/>
+        </w:rPr>
+      </w:pPr>
+      <w:r>
+        <w:rPr>
+          <w:rFonts w:ascii="Times New Roman" w:hAnsi="Times New Roman" w:cs="Times New Roman"/>
+          <w:b/>
+          <w:bCs/>
+          <w:sz w:val="36"/>
+          <w:szCs w:val="36"/>
+        </w:rPr>
+        <w:t>TEST</w:t>
+      </w:r>
+      <w:r>
+        <w:rPr>
+          <w:rFonts w:ascii="Times New Roman" w:hAnsi="Times New Roman" w:cs="Times New Roman"/>
+          <w:b/>
+          <w:bCs/>
+          <w:sz w:val="36"/>
+          <w:szCs w:val="36"/>
+        </w:rPr>
+        <w:t xml:space="preserve"> </w:t>
+      </w:r>
+      <w:r>
+        <w:rPr>
+          <w:rFonts w:ascii="Times New Roman" w:hAnsi="Times New Roman" w:cs="Times New Roman"/>
+          <w:b/>
+          <w:bCs/>
+          <w:sz w:val="36"/>
+          <w:szCs w:val="36"/>
+        </w:rPr>
+        <w:t>SUMMARY</w:t>
+      </w:r>
+      <w:r>
+        <w:rPr>
+          <w:rFonts w:ascii="Times New Roman" w:hAnsi="Times New Roman" w:cs="Times New Roman"/>
+          <w:b/>
+          <w:bCs/>
+          <w:sz w:val="36"/>
+          <w:szCs w:val="36"/>
+        </w:rPr>
+        <w:t xml:space="preserve"> </w:t>
+      </w:r>
+      <w:r>
+        <w:rPr>
+          <w:rFonts w:ascii="Times New Roman" w:hAnsi="Times New Roman" w:cs="Times New Roman"/>
+          <w:b/>
+          <w:bCs/>
+          <w:sz w:val="36"/>
+          <w:szCs w:val="36"/>
+        </w:rPr>
+        <w:t>REPORT</w:t>
+      </w:r>
+    </w:p>
+    <w:p>
+      <w:pPr>
+        <w:pBdr>
+          <w:top w:val="thickThinSmallGap" w:sz="24" w:space="1" w:color="auto"/>
+          <w:left w:val="thickThinSmallGap" w:sz="24" w:space="4" w:color="auto"/>
+          <w:bottom w:val="thinThickSmallGap" w:sz="24" w:space="31" w:color="auto"/>
+          <w:right w:val="thinThickSmallGap" w:sz="24" w:space="4" w:color="auto"/>
+        </w:pBdr>
+        <w:jc w:val="center"/>
+        <w:rPr>
+          <w:rFonts w:ascii="Times New Roman" w:hAnsi="Times New Roman" w:cs="Times New Roman"/>
+          <w:b/>
+          <w:sz w:val="36"/>
+          <w:szCs w:val="36"/>
+        </w:rPr>
+      </w:pPr>
+      <w:r>
+        <w:rPr>
+          <w:rFonts w:ascii="Times New Roman" w:hAnsi="Times New Roman" w:cs="Times New Roman"/>
+          <w:b/>
+          <w:bCs/>
+          <w:sz w:val="36"/>
+          <w:szCs w:val="36"/>
+        </w:rPr>
+        <w:t>Tên đề tài:</w:t>
+      </w:r>
+      <w:r>
+        <w:rPr>
+          <w:rFonts w:ascii="Times New Roman" w:hAnsi="Times New Roman" w:cs="Times New Roman"/>
+          <w:b/>
+          <w:sz w:val="36"/>
+          <w:szCs w:val="36"/>
+        </w:rPr>
+        <w:t xml:space="preserve"> Online Shopping Store</w:t>
+      </w:r>
+    </w:p>
+    <w:p>
+      <w:pPr>
+        <w:pBdr>
+          <w:top w:val="thickThinSmallGap" w:sz="24" w:space="1" w:color="auto"/>
+          <w:left w:val="thickThinSmallGap" w:sz="24" w:space="4" w:color="auto"/>
+          <w:bottom w:val="thinThickSmallGap" w:sz="24" w:space="31" w:color="auto"/>
+          <w:right w:val="thinThickSmallGap" w:sz="24" w:space="4" w:color="auto"/>
+        </w:pBdr>
+        <w:rPr>
+          <w:rFonts w:ascii="Times New Roman" w:hAnsi="Times New Roman" w:cs="Times New Roman"/>
+          <w:b/>
+          <w:bCs/>
+          <w:sz w:val="28"/>
+          <w:szCs w:val="28"/>
+        </w:rPr>
+      </w:pPr>
+    </w:p>
+    <w:p>
+      <w:pPr>
+        <w:pBdr>
+          <w:top w:val="thickThinSmallGap" w:sz="24" w:space="1" w:color="auto"/>
+          <w:left w:val="thickThinSmallGap" w:sz="24" w:space="4" w:color="auto"/>
+          <w:bottom w:val="thinThickSmallGap" w:sz="24" w:space="31" w:color="auto"/>
+          <w:right w:val="thinThickSmallGap" w:sz="24" w:space="4" w:color="auto"/>
+        </w:pBdr>
+        <w:rPr>
+          <w:rFonts w:ascii="Times New Roman" w:hAnsi="Times New Roman" w:cs="Times New Roman"/>
+          <w:b/>
+          <w:bCs/>
+          <w:sz w:val="28"/>
+          <w:szCs w:val="28"/>
+        </w:rPr>
+      </w:pPr>
+    </w:p>
+    <w:p>
+      <w:pPr>
+        <w:pBdr>
+          <w:top w:val="thickThinSmallGap" w:sz="24" w:space="1" w:color="auto"/>
+          <w:left w:val="thickThinSmallGap" w:sz="24" w:space="4" w:color="auto"/>
+          <w:bottom w:val="thinThickSmallGap" w:sz="24" w:space="31" w:color="auto"/>
+          <w:right w:val="thinThickSmallGap" w:sz="24" w:space="4" w:color="auto"/>
+        </w:pBdr>
+        <w:rPr>
+          <w:rFonts w:ascii="Times New Roman" w:hAnsi="Times New Roman" w:cs="Times New Roman"/>
+          <w:b/>
+          <w:bCs/>
+          <w:sz w:val="28"/>
+          <w:szCs w:val="28"/>
+        </w:rPr>
+      </w:pPr>
+    </w:p>
+    <w:p>
+      <w:pPr>
+        <w:pBdr>
+          <w:top w:val="thickThinSmallGap" w:sz="24" w:space="1" w:color="auto"/>
+          <w:left w:val="thickThinSmallGap" w:sz="24" w:space="4" w:color="auto"/>
+          <w:bottom w:val="thinThickSmallGap" w:sz="24" w:space="31" w:color="auto"/>
+          <w:right w:val="thinThickSmallGap" w:sz="24" w:space="4" w:color="auto"/>
+        </w:pBdr>
+        <w:rPr>
+          <w:rFonts w:ascii="Times New Roman" w:hAnsi="Times New Roman" w:cs="Times New Roman"/>
+          <w:b/>
+          <w:bCs/>
+          <w:sz w:val="28"/>
+          <w:szCs w:val="28"/>
+        </w:rPr>
+      </w:pPr>
+    </w:p>
+    <w:p>
+      <w:pPr>
+        <w:pBdr>
+          <w:top w:val="thickThinSmallGap" w:sz="24" w:space="1" w:color="auto"/>
+          <w:left w:val="thickThinSmallGap" w:sz="24" w:space="4" w:color="auto"/>
+          <w:bottom w:val="thinThickSmallGap" w:sz="24" w:space="31" w:color="auto"/>
+          <w:right w:val="thinThickSmallGap" w:sz="24" w:space="4" w:color="auto"/>
+        </w:pBdr>
+        <w:tabs>
+          <w:tab w:val="left" w:pos="1701"/>
+          <w:tab w:val="left" w:pos="5812"/>
+        </w:tabs>
+        <w:rPr>
+          <w:rFonts w:ascii="Times New Roman" w:hAnsi="Times New Roman" w:cs="Times New Roman"/>
+          <w:b/>
+          <w:bCs/>
+          <w:sz w:val="28"/>
+          <w:szCs w:val="28"/>
+        </w:rPr>
+      </w:pPr>
+    </w:p>
+    <w:p>
+      <w:pPr>
+        <w:pBdr>
+          <w:top w:val="thickThinSmallGap" w:sz="24" w:space="1" w:color="auto"/>
+          <w:left w:val="thickThinSmallGap" w:sz="24" w:space="4" w:color="auto"/>
+          <w:bottom w:val="thinThickSmallGap" w:sz="24" w:space="31" w:color="auto"/>
+          <w:right w:val="thinThickSmallGap" w:sz="24" w:space="4" w:color="auto"/>
+        </w:pBdr>
+        <w:tabs>
+          <w:tab w:val="left" w:pos="1701"/>
+          <w:tab w:val="left" w:pos="5812"/>
+        </w:tabs>
+        <w:rPr>
+          <w:rFonts w:ascii="Times New Roman" w:hAnsi="Times New Roman" w:cs="Times New Roman"/>
+          <w:b/>
+          <w:bCs/>
+          <w:sz w:val="28"/>
+          <w:szCs w:val="28"/>
+        </w:rPr>
+      </w:pPr>
+    </w:p>
+    <w:p>
+      <w:pPr>
+        <w:pBdr>
+          <w:top w:val="thickThinSmallGap" w:sz="24" w:space="1" w:color="auto"/>
+          <w:left w:val="thickThinSmallGap" w:sz="24" w:space="4" w:color="auto"/>
+          <w:bottom w:val="thinThickSmallGap" w:sz="24" w:space="31" w:color="auto"/>
+          <w:right w:val="thinThickSmallGap" w:sz="24" w:space="4" w:color="auto"/>
+        </w:pBdr>
+        <w:tabs>
+          <w:tab w:val="left" w:pos="1701"/>
+          <w:tab w:val="left" w:pos="5812"/>
+        </w:tabs>
+        <w:rPr>
+          <w:rFonts w:ascii="Times New Roman" w:hAnsi="Times New Roman" w:cs="Times New Roman"/>
+          <w:b/>
+          <w:bCs/>
+          <w:sz w:val="28"/>
+          <w:szCs w:val="28"/>
+        </w:rPr>
+      </w:pPr>
+    </w:p>
+    <w:p>
+      <w:pPr>
+        <w:pBdr>
+          <w:top w:val="thickThinSmallGap" w:sz="24" w:space="1" w:color="auto"/>
+          <w:left w:val="thickThinSmallGap" w:sz="24" w:space="4" w:color="auto"/>
+          <w:bottom w:val="thinThickSmallGap" w:sz="24" w:space="31" w:color="auto"/>
+          <w:right w:val="thinThickSmallGap" w:sz="24" w:space="4" w:color="auto"/>
+        </w:pBdr>
+        <w:tabs>
+          <w:tab w:val="left" w:pos="1701"/>
+          <w:tab w:val="left" w:pos="5812"/>
+        </w:tabs>
+        <w:rPr>
+          <w:rFonts w:ascii="Times New Roman" w:hAnsi="Times New Roman" w:cs="Times New Roman"/>
+          <w:b/>
+          <w:bCs/>
+          <w:sz w:val="28"/>
+          <w:szCs w:val="28"/>
+        </w:rPr>
+      </w:pPr>
+    </w:p>
+    <w:p>
+      <w:pPr>
+        <w:pBdr>
+          <w:top w:val="thickThinSmallGap" w:sz="24" w:space="1" w:color="auto"/>
+          <w:left w:val="thickThinSmallGap" w:sz="24" w:space="4" w:color="auto"/>
+          <w:bottom w:val="thinThickSmallGap" w:sz="24" w:space="31" w:color="auto"/>
+          <w:right w:val="thinThickSmallGap" w:sz="24" w:space="4" w:color="auto"/>
+        </w:pBdr>
+        <w:tabs>
+          <w:tab w:val="left" w:pos="2694"/>
+        </w:tabs>
+        <w:rPr>
+          <w:rFonts w:ascii="Times New Roman" w:hAnsi="Times New Roman" w:cs="Times New Roman"/>
+          <w:b/>
+          <w:bCs/>
+          <w:sz w:val="28"/>
+          <w:szCs w:val="28"/>
+        </w:rPr>
+      </w:pPr>
+    </w:p>
+    <w:p>
+      <w:pPr>
+        <w:pBdr>
+          <w:top w:val="thickThinSmallGap" w:sz="24" w:space="1" w:color="auto"/>
+          <w:left w:val="thickThinSmallGap" w:sz="24" w:space="4" w:color="auto"/>
+          <w:bottom w:val="thinThickSmallGap" w:sz="24" w:space="31" w:color="auto"/>
+          <w:right w:val="thinThickSmallGap" w:sz="24" w:space="4" w:color="auto"/>
+        </w:pBdr>
+        <w:tabs>
+          <w:tab w:val="left" w:pos="2694"/>
+        </w:tabs>
+        <w:rPr>
+          <w:rFonts w:ascii="Times New Roman" w:hAnsi="Times New Roman" w:cs="Times New Roman"/>
+          <w:b/>
+          <w:bCs/>
+          <w:sz w:val="28"/>
+          <w:szCs w:val="28"/>
+        </w:rPr>
+      </w:pPr>
+    </w:p>
+    <w:p>
+      <w:pPr>
+        <w:pBdr>
+          <w:top w:val="thickThinSmallGap" w:sz="24" w:space="1" w:color="auto"/>
+          <w:left w:val="thickThinSmallGap" w:sz="24" w:space="4" w:color="auto"/>
+          <w:bottom w:val="thinThickSmallGap" w:sz="24" w:space="31" w:color="auto"/>
+          <w:right w:val="thinThickSmallGap" w:sz="24" w:space="4" w:color="auto"/>
+        </w:pBdr>
+        <w:tabs>
+          <w:tab w:val="left" w:pos="2694"/>
+        </w:tabs>
+        <w:rPr>
+          <w:rFonts w:ascii="Times New Roman" w:hAnsi="Times New Roman" w:cs="Times New Roman"/>
+          <w:b/>
+          <w:bCs/>
+          <w:sz w:val="28"/>
+          <w:szCs w:val="28"/>
+        </w:rPr>
+      </w:pPr>
+    </w:p>
+    <w:p>
+      <w:pPr>
+        <w:pBdr>
+          <w:top w:val="thickThinSmallGap" w:sz="24" w:space="1" w:color="auto"/>
+          <w:left w:val="thickThinSmallGap" w:sz="24" w:space="4" w:color="auto"/>
+          <w:bottom w:val="thinThickSmallGap" w:sz="24" w:space="31" w:color="auto"/>
+          <w:right w:val="thinThickSmallGap" w:sz="24" w:space="4" w:color="auto"/>
+        </w:pBdr>
+        <w:tabs>
+          <w:tab w:val="left" w:pos="3544"/>
+        </w:tabs>
+        <w:rPr>
+          <w:rFonts w:ascii="Times New Roman" w:hAnsi="Times New Roman" w:cs="Times New Roman"/>
+          <w:b/>
+          <w:bCs/>
+          <w:sz w:val="28"/>
+          <w:szCs w:val="28"/>
+        </w:rPr>
+      </w:pPr>
+      <w:r>
+        <w:rPr>
+          <w:rFonts w:ascii="Times New Roman" w:hAnsi="Times New Roman" w:cs="Times New Roman"/>
+          <w:b/>
+          <w:bCs/>
+          <w:sz w:val="28"/>
+          <w:szCs w:val="28"/>
+        </w:rPr>
+        <w:tab/>
+        <w:t>Hồ Chí Minh, năm 2026</w:t>
+      </w:r>
+    </w:p>
+    <w:sdt>
+      <w:sdtPr>
+        <w:id w:val="909042058"/>
+        <w:docPartObj>
+          <w:docPartGallery w:val="Table of Contents"/>
+          <w:docPartUnique/>
+        </w:docPartObj>
+      </w:sdtPr>
+      <w:sdtEndPr>
+        <w:rPr>
+          <w:rFonts w:asciiTheme="minorHAnsi" w:eastAsiaTheme="minorHAnsi" w:hAnsiTheme="minorHAnsi" w:cstheme="minorBidi"/>
+          <w:b/>
+          <w:bCs/>
+          <w:noProof/>
+          <w:color w:val="auto"/>
+          <w:sz w:val="22"/>
+          <w:szCs w:val="22"/>
+        </w:rPr>
+      </w:sdtEndPr>
+      <w:sdtContent>
+        <w:p>
+          <w:pPr>
+            <w:pStyle w:val="TOCHeading"/>
+            <w:rPr>
+              <w:rFonts w:ascii="Times New Roman" w:hAnsi="Times New Roman" w:cs="Times New Roman"/>
+              <w:color w:val="auto"/>
+              <w:sz w:val="26"/>
+              <w:szCs w:val="26"/>
+            </w:rPr>
+          </w:pPr>
+          <w:r>
+            <w:rPr>
+              <w:rFonts w:ascii="Times New Roman" w:hAnsi="Times New Roman" w:cs="Times New Roman"/>
+              <w:color w:val="auto"/>
+              <w:sz w:val="26"/>
+              <w:szCs w:val="26"/>
+            </w:rPr>
+            <w:t>Mục lục</w:t>
+          </w:r>
+        </w:p>
+        <w:p>
+          <w:pPr>
+            <w:pStyle w:val="TOC1"/>
+            <w:tabs>
+              <w:tab w:val="right" w:leader="dot" w:pos="9350"/>
+            </w:tabs>
+            <w:rPr>
+              <w:rFonts w:ascii="Times New Roman" w:eastAsiaTheme="minorEastAsia" w:hAnsi="Times New Roman" w:cs="Times New Roman"/>
+              <w:noProof/>
+              <w:kern w:val="2"/>
+              <w:sz w:val="26"/>
+              <w:szCs w:val="26"/>
+              <w:lang w:val="en-ID" w:eastAsia="en-ID"/>
+              <w14:ligatures w14:val="standardContextual"/>
+            </w:rPr>
+          </w:pPr>
+          <w:r>
+            <w:rPr>
+              <w:rFonts w:ascii="Times New Roman" w:hAnsi="Times New Roman" w:cs="Times New Roman"/>
+              <w:sz w:val="26"/>
+              <w:szCs w:val="26"/>
+            </w:rPr>
+            <w:fldChar w:fldCharType="begin"/>
+          </w:r>
+          <w:r>
+            <w:rPr>
+              <w:rFonts w:ascii="Times New Roman" w:hAnsi="Times New Roman" w:cs="Times New Roman"/>
+              <w:sz w:val="26"/>
+              <w:szCs w:val="26"/>
+            </w:rPr>
+            <w:instrText xml:space="preserve"> TOC \o "1-3" \h \z \u </w:instrText>
+          </w:r>
+          <w:r>
+            <w:rPr>
+              <w:rFonts w:ascii="Times New Roman" w:hAnsi="Times New Roman" w:cs="Times New Roman"/>
+              <w:sz w:val="26"/>
+              <w:szCs w:val="26"/>
+            </w:rPr>
+            <w:fldChar w:fldCharType="separate"/>
+          </w:r>
+          <w:hyperlink w:anchor="_Toc240391343" w:history="1">
+            <w:r>
+              <w:rPr>
+                <w:rStyle w:val="Hyperlink"/>
+                <w:rFonts w:ascii="Times New Roman" w:hAnsi="Times New Roman" w:cs="Times New Roman"/>
+                <w:noProof/>
+                <w:color w:val="auto"/>
+                <w:sz w:val="26"/>
+                <w:szCs w:val="26"/>
+              </w:rPr>
+              <w:t>1. Tổng quan</w:t>
+            </w:r>
+            <w:r>
+              <w:rPr>
+                <w:rFonts w:ascii="Times New Roman" w:hAnsi="Times New Roman" w:cs="Times New Roman"/>
+                <w:noProof/>
+                <w:webHidden/>
+                <w:sz w:val="26"/>
+                <w:szCs w:val="26"/>
+              </w:rPr>
+              <w:tab/>
+            </w:r>
+            <w:r>
+              <w:rPr>
+                <w:rFonts w:ascii="Times New Roman" w:hAnsi="Times New Roman" w:cs="Times New Roman"/>
+                <w:noProof/>
+                <w:webHidden/>
+                <w:sz w:val="26"/>
+                <w:szCs w:val="26"/>
+              </w:rPr>
+              <w:fldChar w:fldCharType="begin"/>
+            </w:r>
+            <w:r>
+              <w:rPr>
+                <w:rFonts w:ascii="Times New Roman" w:hAnsi="Times New Roman" w:cs="Times New Roman"/>
+                <w:noProof/>
+                <w:webHidden/>
+                <w:sz w:val="26"/>
+                <w:szCs w:val="26"/>
+              </w:rPr>
+              <w:instrText xml:space="preserve"> PAGEREF _Toc240391343 \h </w:instrText>
+            </w:r>
+            <w:r>
+              <w:rPr>
+                <w:rFonts w:ascii="Times New Roman" w:hAnsi="Times New Roman" w:cs="Times New Roman"/>
+                <w:noProof/>
+                <w:webHidden/>
+                <w:sz w:val="26"/>
+                <w:szCs w:val="26"/>
+              </w:rPr>
+            </w:r>
+            <w:r>
+              <w:rPr>
+                <w:rFonts w:ascii="Times New Roman" w:hAnsi="Times New Roman" w:cs="Times New Roman"/>
+                <w:noProof/>
+                <w:webHidden/>
+                <w:sz w:val="26"/>
+                <w:szCs w:val="26"/>
+              </w:rPr>
+              <w:fldChar w:fldCharType="separate"/>
+            </w:r>
+            <w:r>
+              <w:rPr>
+                <w:rFonts w:ascii="Times New Roman" w:hAnsi="Times New Roman" w:cs="Times New Roman"/>
+                <w:noProof/>
+                <w:webHidden/>
+                <w:sz w:val="26"/>
+                <w:szCs w:val="26"/>
+              </w:rPr>
+              <w:t>1</w:t>
+            </w:r>
+            <w:r>
+              <w:rPr>
+                <w:rFonts w:ascii="Times New Roman" w:hAnsi="Times New Roman" w:cs="Times New Roman"/>
+                <w:noProof/>
+                <w:webHidden/>
+                <w:sz w:val="26"/>
+                <w:szCs w:val="26"/>
+              </w:rPr>
+              <w:fldChar w:fldCharType="end"/>
+            </w:r>
+          </w:hyperlink>
+        </w:p>
+        <w:p>
+          <w:pPr>
+            <w:pStyle w:val="TOC1"/>
+            <w:tabs>
+              <w:tab w:val="right" w:leader="dot" w:pos="9350"/>
+            </w:tabs>
+            <w:rPr>
+              <w:rFonts w:ascii="Times New Roman" w:eastAsiaTheme="minorEastAsia" w:hAnsi="Times New Roman" w:cs="Times New Roman"/>
+              <w:noProof/>
+              <w:kern w:val="2"/>
+              <w:sz w:val="26"/>
+              <w:szCs w:val="26"/>
+              <w:lang w:val="en-ID" w:eastAsia="en-ID"/>
+              <w14:ligatures w14:val="standardContextual"/>
+            </w:rPr>
+          </w:pPr>
+          <w:hyperlink w:anchor="_Toc240391344" w:history="1">
+            <w:r>
+              <w:rPr>
+                <w:rStyle w:val="Hyperlink"/>
+                <w:rFonts w:ascii="Times New Roman" w:hAnsi="Times New Roman" w:cs="Times New Roman"/>
+                <w:noProof/>
+                <w:color w:val="auto"/>
+                <w:sz w:val="26"/>
+                <w:szCs w:val="26"/>
+              </w:rPr>
+              <w:t>2. Kết quả tổng hợp theo module</w:t>
+            </w:r>
+            <w:r>
+              <w:rPr>
+                <w:rFonts w:ascii="Times New Roman" w:hAnsi="Times New Roman" w:cs="Times New Roman"/>
+                <w:noProof/>
+                <w:webHidden/>
+                <w:sz w:val="26"/>
+                <w:szCs w:val="26"/>
+              </w:rPr>
+              <w:tab/>
+            </w:r>
+            <w:r>
+              <w:rPr>
+                <w:rFonts w:ascii="Times New Roman" w:hAnsi="Times New Roman" w:cs="Times New Roman"/>
+                <w:noProof/>
+                <w:webHidden/>
+                <w:sz w:val="26"/>
+                <w:szCs w:val="26"/>
+              </w:rPr>
+              <w:fldChar w:fldCharType="begin"/>
+            </w:r>
+            <w:r>
+              <w:rPr>
+                <w:rFonts w:ascii="Times New Roman" w:hAnsi="Times New Roman" w:cs="Times New Roman"/>
+                <w:noProof/>
+                <w:webHidden/>
+                <w:sz w:val="26"/>
+                <w:szCs w:val="26"/>
+              </w:rPr>
+              <w:instrText xml:space="preserve"> PAGEREF _Toc240391344 \h </w:instrText>
+            </w:r>
+            <w:r>
+              <w:rPr>
+                <w:rFonts w:ascii="Times New Roman" w:hAnsi="Times New Roman" w:cs="Times New Roman"/>
+                <w:noProof/>
+                <w:webHidden/>
+                <w:sz w:val="26"/>
+                <w:szCs w:val="26"/>
+              </w:rPr>
+            </w:r>
+            <w:r>
+              <w:rPr>
+                <w:rFonts w:ascii="Times New Roman" w:hAnsi="Times New Roman" w:cs="Times New Roman"/>
+                <w:noProof/>
+                <w:webHidden/>
+                <w:sz w:val="26"/>
+                <w:szCs w:val="26"/>
+              </w:rPr>
+              <w:fldChar w:fldCharType="separate"/>
+            </w:r>
+            <w:r>
+              <w:rPr>
+                <w:rFonts w:ascii="Times New Roman" w:hAnsi="Times New Roman" w:cs="Times New Roman"/>
+                <w:noProof/>
+                <w:webHidden/>
+                <w:sz w:val="26"/>
+                <w:szCs w:val="26"/>
+              </w:rPr>
+              <w:t>1</w:t>
+            </w:r>
+            <w:r>
+              <w:rPr>
+                <w:rFonts w:ascii="Times New Roman" w:hAnsi="Times New Roman" w:cs="Times New Roman"/>
+                <w:noProof/>
+                <w:webHidden/>
+                <w:sz w:val="26"/>
+                <w:szCs w:val="26"/>
+              </w:rPr>
+              <w:fldChar w:fldCharType="end"/>
+            </w:r>
+          </w:hyperlink>
+        </w:p>
+        <w:p>
+          <w:pPr>
+            <w:pStyle w:val="TOC1"/>
+            <w:tabs>
+              <w:tab w:val="right" w:leader="dot" w:pos="9350"/>
+            </w:tabs>
+            <w:rPr>
+              <w:rFonts w:ascii="Times New Roman" w:eastAsiaTheme="minorEastAsia" w:hAnsi="Times New Roman" w:cs="Times New Roman"/>
+              <w:noProof/>
+              <w:kern w:val="2"/>
+              <w:sz w:val="26"/>
+              <w:szCs w:val="26"/>
+              <w:lang w:val="en-ID" w:eastAsia="en-ID"/>
+              <w14:ligatures w14:val="standardContextual"/>
+            </w:rPr>
+          </w:pPr>
+          <w:hyperlink w:anchor="_Toc240391345" w:history="1">
+            <w:r>
+              <w:rPr>
+                <w:rStyle w:val="Hyperlink"/>
+                <w:rFonts w:ascii="Times New Roman" w:hAnsi="Times New Roman" w:cs="Times New Roman"/>
+                <w:noProof/>
+                <w:color w:val="auto"/>
+                <w:sz w:val="26"/>
+                <w:szCs w:val="26"/>
+              </w:rPr>
+              <w:t>3. Danh sách Bug theo mức độ</w:t>
+            </w:r>
+            <w:r>
+              <w:rPr>
+                <w:rFonts w:ascii="Times New Roman" w:hAnsi="Times New Roman" w:cs="Times New Roman"/>
+                <w:noProof/>
+                <w:webHidden/>
+                <w:sz w:val="26"/>
+                <w:szCs w:val="26"/>
+              </w:rPr>
+              <w:tab/>
+            </w:r>
+            <w:r>
+              <w:rPr>
+                <w:rFonts w:ascii="Times New Roman" w:hAnsi="Times New Roman" w:cs="Times New Roman"/>
+                <w:noProof/>
+                <w:webHidden/>
+                <w:sz w:val="26"/>
+                <w:szCs w:val="26"/>
+              </w:rPr>
+              <w:fldChar w:fldCharType="begin"/>
+            </w:r>
+            <w:r>
+              <w:rPr>
+                <w:rFonts w:ascii="Times New Roman" w:hAnsi="Times New Roman" w:cs="Times New Roman"/>
+                <w:noProof/>
+                <w:webHidden/>
+                <w:sz w:val="26"/>
+                <w:szCs w:val="26"/>
+              </w:rPr>
+              <w:instrText xml:space="preserve"> PAGEREF _Toc240391345 \h </w:instrText>
+            </w:r>
+            <w:r>
+              <w:rPr>
+                <w:rFonts w:ascii="Times New Roman" w:hAnsi="Times New Roman" w:cs="Times New Roman"/>
+                <w:noProof/>
+                <w:webHidden/>
+                <w:sz w:val="26"/>
+                <w:szCs w:val="26"/>
+              </w:rPr>
+            </w:r>
+            <w:r>
+              <w:rPr>
+                <w:rFonts w:ascii="Times New Roman" w:hAnsi="Times New Roman" w:cs="Times New Roman"/>
+                <w:noProof/>
+                <w:webHidden/>
+                <w:sz w:val="26"/>
+                <w:szCs w:val="26"/>
+              </w:rPr>
+              <w:fldChar w:fldCharType="separate"/>
+            </w:r>
+            <w:r>
+              <w:rPr>
+                <w:rFonts w:ascii="Times New Roman" w:hAnsi="Times New Roman" w:cs="Times New Roman"/>
+                <w:noProof/>
+                <w:webHidden/>
+                <w:sz w:val="26"/>
+                <w:szCs w:val="26"/>
+              </w:rPr>
+              <w:t>1</w:t>
+            </w:r>
+            <w:r>
+              <w:rPr>
+                <w:rFonts w:ascii="Times New Roman" w:hAnsi="Times New Roman" w:cs="Times New Roman"/>
+                <w:noProof/>
+                <w:webHidden/>
+                <w:sz w:val="26"/>
+                <w:szCs w:val="26"/>
+              </w:rPr>
+              <w:fldChar w:fldCharType="end"/>
+            </w:r>
+          </w:hyperlink>
+        </w:p>
+        <w:p>
+          <w:pPr>
+            <w:pStyle w:val="TOC1"/>
+            <w:tabs>
+              <w:tab w:val="right" w:leader="dot" w:pos="9350"/>
+            </w:tabs>
+            <w:rPr>
+              <w:rFonts w:ascii="Times New Roman" w:eastAsiaTheme="minorEastAsia" w:hAnsi="Times New Roman" w:cs="Times New Roman"/>
+              <w:noProof/>
+              <w:kern w:val="2"/>
+              <w:sz w:val="26"/>
+              <w:szCs w:val="26"/>
+              <w:lang w:val="en-ID" w:eastAsia="en-ID"/>
+              <w14:ligatures w14:val="standardContextual"/>
+            </w:rPr>
+          </w:pPr>
+          <w:hyperlink w:anchor="_Toc240391346" w:history="1">
+            <w:r>
+              <w:rPr>
+                <w:rStyle w:val="Hyperlink"/>
+                <w:rFonts w:ascii="Times New Roman" w:hAnsi="Times New Roman" w:cs="Times New Roman"/>
+                <w:noProof/>
+                <w:color w:val="auto"/>
+                <w:sz w:val="26"/>
+                <w:szCs w:val="26"/>
+              </w:rPr>
+              <w:t>4. Kết quả Unit Test</w:t>
+            </w:r>
+            <w:r>
+              <w:rPr>
+                <w:rFonts w:ascii="Times New Roman" w:hAnsi="Times New Roman" w:cs="Times New Roman"/>
+                <w:noProof/>
+                <w:webHidden/>
+                <w:sz w:val="26"/>
+                <w:szCs w:val="26"/>
+              </w:rPr>
+              <w:tab/>
+            </w:r>
+            <w:r>
+              <w:rPr>
+                <w:rFonts w:ascii="Times New Roman" w:hAnsi="Times New Roman" w:cs="Times New Roman"/>
+                <w:noProof/>
+                <w:webHidden/>
+                <w:sz w:val="26"/>
+                <w:szCs w:val="26"/>
+              </w:rPr>
+              <w:fldChar w:fldCharType="begin"/>
+            </w:r>
+            <w:r>
+              <w:rPr>
+                <w:rFonts w:ascii="Times New Roman" w:hAnsi="Times New Roman" w:cs="Times New Roman"/>
+                <w:noProof/>
+                <w:webHidden/>
+                <w:sz w:val="26"/>
+                <w:szCs w:val="26"/>
+              </w:rPr>
+              <w:instrText xml:space="preserve"> PAGEREF _Toc240391346 \h </w:instrText>
+            </w:r>
+            <w:r>
+              <w:rPr>
+                <w:rFonts w:ascii="Times New Roman" w:hAnsi="Times New Roman" w:cs="Times New Roman"/>
+                <w:noProof/>
+                <w:webHidden/>
+                <w:sz w:val="26"/>
+                <w:szCs w:val="26"/>
+              </w:rPr>
+            </w:r>
+            <w:r>
+              <w:rPr>
+                <w:rFonts w:ascii="Times New Roman" w:hAnsi="Times New Roman" w:cs="Times New Roman"/>
+                <w:noProof/>
+                <w:webHidden/>
+                <w:sz w:val="26"/>
+                <w:szCs w:val="26"/>
+              </w:rPr>
+              <w:fldChar w:fldCharType="separate"/>
+            </w:r>
+            <w:r>
+              <w:rPr>
+                <w:rFonts w:ascii="Times New Roman" w:hAnsi="Times New Roman" w:cs="Times New Roman"/>
+                <w:noProof/>
+                <w:webHidden/>
+                <w:sz w:val="26"/>
+                <w:szCs w:val="26"/>
+              </w:rPr>
+              <w:t>2</w:t>
+            </w:r>
+            <w:r>
+              <w:rPr>
+                <w:rFonts w:ascii="Times New Roman" w:hAnsi="Times New Roman" w:cs="Times New Roman"/>
+                <w:noProof/>
+                <w:webHidden/>
+                <w:sz w:val="26"/>
+                <w:szCs w:val="26"/>
+              </w:rPr>
+              <w:fldChar w:fldCharType="end"/>
+            </w:r>
+          </w:hyperlink>
+        </w:p>
+        <w:p>
+          <w:pPr>
+            <w:pStyle w:val="TOC1"/>
+            <w:tabs>
+              <w:tab w:val="right" w:leader="dot" w:pos="9350"/>
+            </w:tabs>
+            <w:rPr>
+              <w:rFonts w:ascii="Times New Roman" w:eastAsiaTheme="minorEastAsia" w:hAnsi="Times New Roman" w:cs="Times New Roman"/>
+              <w:noProof/>
+              <w:kern w:val="2"/>
+              <w:sz w:val="26"/>
+              <w:szCs w:val="26"/>
+              <w:lang w:val="en-ID" w:eastAsia="en-ID"/>
+              <w14:ligatures w14:val="standardContextual"/>
+            </w:rPr>
+          </w:pPr>
+          <w:hyperlink w:anchor="_Toc240391347" w:history="1">
+            <w:r>
+              <w:rPr>
+                <w:rStyle w:val="Hyperlink"/>
+                <w:rFonts w:ascii="Times New Roman" w:hAnsi="Times New Roman" w:cs="Times New Roman"/>
+                <w:noProof/>
+                <w:color w:val="auto"/>
+                <w:sz w:val="26"/>
+                <w:szCs w:val="26"/>
+              </w:rPr>
+              <w:t>5. Kết quả CodeceptJS (E2E Automation)</w:t>
+            </w:r>
+            <w:r>
+              <w:rPr>
+                <w:rFonts w:ascii="Times New Roman" w:hAnsi="Times New Roman" w:cs="Times New Roman"/>
+                <w:noProof/>
+                <w:webHidden/>
+                <w:sz w:val="26"/>
+                <w:szCs w:val="26"/>
+              </w:rPr>
+              <w:tab/>
+            </w:r>
+            <w:r>
+              <w:rPr>
+                <w:rFonts w:ascii="Times New Roman" w:hAnsi="Times New Roman" w:cs="Times New Roman"/>
+                <w:noProof/>
+                <w:webHidden/>
+                <w:sz w:val="26"/>
+                <w:szCs w:val="26"/>
+              </w:rPr>
+              <w:fldChar w:fldCharType="begin"/>
+            </w:r>
+            <w:r>
+              <w:rPr>
+                <w:rFonts w:ascii="Times New Roman" w:hAnsi="Times New Roman" w:cs="Times New Roman"/>
+                <w:noProof/>
+                <w:webHidden/>
+                <w:sz w:val="26"/>
+                <w:szCs w:val="26"/>
+              </w:rPr>
+              <w:instrText xml:space="preserve"> PAGEREF _Toc240391347 \h </w:instrText>
+            </w:r>
+            <w:r>
+              <w:rPr>
+                <w:rFonts w:ascii="Times New Roman" w:hAnsi="Times New Roman" w:cs="Times New Roman"/>
+                <w:noProof/>
+                <w:webHidden/>
+                <w:sz w:val="26"/>
+                <w:szCs w:val="26"/>
+              </w:rPr>
+            </w:r>
+            <w:r>
+              <w:rPr>
+                <w:rFonts w:ascii="Times New Roman" w:hAnsi="Times New Roman" w:cs="Times New Roman"/>
+                <w:noProof/>
+                <w:webHidden/>
+                <w:sz w:val="26"/>
+                <w:szCs w:val="26"/>
+              </w:rPr>
+              <w:fldChar w:fldCharType="separate"/>
+            </w:r>
+            <w:r>
+              <w:rPr>
+                <w:rFonts w:ascii="Times New Roman" w:hAnsi="Times New Roman" w:cs="Times New Roman"/>
+                <w:noProof/>
+                <w:webHidden/>
+                <w:sz w:val="26"/>
+                <w:szCs w:val="26"/>
+              </w:rPr>
+              <w:t>2</w:t>
+            </w:r>
+            <w:r>
+              <w:rPr>
+                <w:rFonts w:ascii="Times New Roman" w:hAnsi="Times New Roman" w:cs="Times New Roman"/>
+                <w:noProof/>
+                <w:webHidden/>
+                <w:sz w:val="26"/>
+                <w:szCs w:val="26"/>
+              </w:rPr>
+              <w:fldChar w:fldCharType="end"/>
+            </w:r>
+          </w:hyperlink>
+        </w:p>
+        <w:p>
+          <w:pPr>
+            <w:pStyle w:val="TOC1"/>
+            <w:tabs>
+              <w:tab w:val="right" w:leader="dot" w:pos="9350"/>
+            </w:tabs>
+            <w:rPr>
+              <w:rFonts w:ascii="Times New Roman" w:eastAsiaTheme="minorEastAsia" w:hAnsi="Times New Roman" w:cs="Times New Roman"/>
+              <w:noProof/>
+              <w:kern w:val="2"/>
+              <w:sz w:val="26"/>
+              <w:szCs w:val="26"/>
+              <w:lang w:val="en-ID" w:eastAsia="en-ID"/>
+              <w14:ligatures w14:val="standardContextual"/>
+            </w:rPr>
+          </w:pPr>
+          <w:hyperlink w:anchor="_Toc240391348" w:history="1">
+            <w:r>
+              <w:rPr>
+                <w:rStyle w:val="Hyperlink"/>
+                <w:rFonts w:ascii="Times New Roman" w:hAnsi="Times New Roman" w:cs="Times New Roman"/>
+                <w:noProof/>
+                <w:color w:val="auto"/>
+                <w:sz w:val="26"/>
+                <w:szCs w:val="26"/>
+              </w:rPr>
+              <w:t>6. Điểm nhấn + Kết luận</w:t>
+            </w:r>
+            <w:r>
+              <w:rPr>
+                <w:rFonts w:ascii="Times New Roman" w:hAnsi="Times New Roman" w:cs="Times New Roman"/>
+                <w:noProof/>
+                <w:webHidden/>
+                <w:sz w:val="26"/>
+                <w:szCs w:val="26"/>
+              </w:rPr>
+              <w:tab/>
+            </w:r>
+            <w:r>
+              <w:rPr>
+                <w:rFonts w:ascii="Times New Roman" w:hAnsi="Times New Roman" w:cs="Times New Roman"/>
+                <w:noProof/>
+                <w:webHidden/>
+                <w:sz w:val="26"/>
+                <w:szCs w:val="26"/>
+              </w:rPr>
+              <w:fldChar w:fldCharType="begin"/>
+            </w:r>
+            <w:r>
+              <w:rPr>
+                <w:rFonts w:ascii="Times New Roman" w:hAnsi="Times New Roman" w:cs="Times New Roman"/>
+                <w:noProof/>
+                <w:webHidden/>
+                <w:sz w:val="26"/>
+                <w:szCs w:val="26"/>
+              </w:rPr>
+              <w:instrText xml:space="preserve"> PAGEREF _Toc240391348 \h </w:instrText>
+            </w:r>
+            <w:r>
+              <w:rPr>
+                <w:rFonts w:ascii="Times New Roman" w:hAnsi="Times New Roman" w:cs="Times New Roman"/>
+                <w:noProof/>
+                <w:webHidden/>
+                <w:sz w:val="26"/>
+                <w:szCs w:val="26"/>
+              </w:rPr>
+            </w:r>
+            <w:r>
+              <w:rPr>
+                <w:rFonts w:ascii="Times New Roman" w:hAnsi="Times New Roman" w:cs="Times New Roman"/>
+                <w:noProof/>
+                <w:webHidden/>
+                <w:sz w:val="26"/>
+                <w:szCs w:val="26"/>
+              </w:rPr>
+              <w:fldChar w:fldCharType="separate"/>
+            </w:r>
+            <w:r>
+              <w:rPr>
+                <w:rFonts w:ascii="Times New Roman" w:hAnsi="Times New Roman" w:cs="Times New Roman"/>
+                <w:noProof/>
+                <w:webHidden/>
+                <w:sz w:val="26"/>
+                <w:szCs w:val="26"/>
+              </w:rPr>
+              <w:t>2</w:t>
+            </w:r>
+            <w:r>
+              <w:rPr>
+                <w:rFonts w:ascii="Times New Roman" w:hAnsi="Times New Roman" w:cs="Times New Roman"/>
+                <w:noProof/>
+                <w:webHidden/>
+                <w:sz w:val="26"/>
+                <w:szCs w:val="26"/>
+              </w:rPr>
+              <w:fldChar w:fldCharType="end"/>
+            </w:r>
+          </w:hyperlink>
+        </w:p>
+        <w:p>
+          <w:r>
+            <w:rPr>
+              <w:rFonts w:ascii="Times New Roman" w:hAnsi="Times New Roman" w:cs="Times New Roman"/>
+              <w:b/>
+              <w:bCs/>
+              <w:noProof/>
+              <w:sz w:val="26"/>
+              <w:szCs w:val="26"/>
+            </w:rPr>
+            <w:fldChar w:fldCharType="end"/>
+          </w:r>
+        </w:p>
+      </w:sdtContent>
+    </w:sdt>
+    <w:p>
+      <w:pPr>
+        <w:rPr>
+          <w:rFonts w:ascii="Times New Roman" w:hAnsi="Times New Roman" w:cs="Times New Roman"/>
+          <w:sz w:val="26"/>
+          <w:szCs w:val="26"/>
+        </w:rPr>
+      </w:pPr>
+    </w:p>
+    <w:p>
+      <w:pPr>
+        <w:rPr>
+          <w:rFonts w:ascii="Times New Roman" w:hAnsi="Times New Roman" w:cs="Times New Roman"/>
+          <w:sz w:val="26"/>
+          <w:szCs w:val="26"/>
+        </w:rPr>
+        <w:sectPr>
+          <w:footerReference w:type="default" r:id="rId9"/>
+          <w:pgSz w:w="12240" w:h="15840"/>
+          <w:pgMar w:top="1440" w:right="1440" w:bottom="1440" w:left="1440" w:header="720" w:footer="720" w:gutter="0"/>
+          <w:cols w:space="720"/>
+          <w:docGrid w:linePitch="360"/>
+        </w:sectPr>
+      </w:pPr>
     </w:p>
     <w:p>
       <w:pPr>
@@ -73,15 +1256,19 @@
           <w:szCs w:val="26"/>
         </w:rPr>
       </w:pPr>
-      <w:r>
-        <w:rPr>
-          <w:szCs w:val="26"/>
-        </w:rPr>
+      <w:bookmarkStart w:id="0" w:name="_Toc240391343"/>
+      <w:r>
+        <w:rPr>
+          <w:szCs w:val="26"/>
+        </w:rPr>
+        <w:lastRenderedPageBreak/>
         <w:t>1. Tổng quan</w:t>
       </w:r>
-    </w:p>
-    <w:p>
-      <w:pPr>
+      <w:bookmarkEnd w:id="0"/>
+    </w:p>
+    <w:p>
+      <w:pPr>
+        <w:jc w:val="both"/>
         <w:rPr>
           <w:rFonts w:ascii="Times New Roman" w:hAnsi="Times New Roman" w:cs="Times New Roman"/>
           <w:sz w:val="26"/>
@@ -131,6 +1318,7 @@
     </w:p>
     <w:p>
       <w:pPr>
+        <w:jc w:val="both"/>
         <w:rPr>
           <w:rFonts w:ascii="Times New Roman" w:hAnsi="Times New Roman" w:cs="Times New Roman"/>
           <w:sz w:val="26"/>
@@ -148,6 +1336,7 @@
     </w:p>
     <w:p>
       <w:pPr>
+        <w:jc w:val="both"/>
         <w:rPr>
           <w:rFonts w:ascii="Times New Roman" w:hAnsi="Times New Roman" w:cs="Times New Roman"/>
           <w:sz w:val="26"/>
@@ -165,6 +1354,7 @@
     </w:p>
     <w:p>
       <w:pPr>
+        <w:jc w:val="both"/>
         <w:rPr>
           <w:rFonts w:ascii="Times New Roman" w:hAnsi="Times New Roman" w:cs="Times New Roman"/>
           <w:sz w:val="26"/>
@@ -182,6 +1372,7 @@
     </w:p>
     <w:p>
       <w:pPr>
+        <w:jc w:val="both"/>
         <w:rPr>
           <w:rFonts w:ascii="Times New Roman" w:hAnsi="Times New Roman" w:cs="Times New Roman"/>
           <w:sz w:val="26"/>
@@ -199,6 +1390,7 @@
     </w:p>
     <w:p>
       <w:pPr>
+        <w:jc w:val="both"/>
         <w:rPr>
           <w:rFonts w:ascii="Times New Roman" w:hAnsi="Times New Roman" w:cs="Times New Roman"/>
           <w:sz w:val="26"/>
@@ -232,6 +1424,7 @@
     </w:p>
     <w:p>
       <w:pPr>
+        <w:jc w:val="both"/>
         <w:rPr>
           <w:rFonts w:ascii="Times New Roman" w:hAnsi="Times New Roman" w:cs="Times New Roman"/>
           <w:sz w:val="26"/>
@@ -249,6 +1442,7 @@
     </w:p>
     <w:p>
       <w:pPr>
+        <w:jc w:val="both"/>
         <w:rPr>
           <w:rFonts w:ascii="Times New Roman" w:hAnsi="Times New Roman" w:cs="Times New Roman"/>
           <w:sz w:val="26"/>
@@ -275,26 +1469,19 @@
     </w:p>
     <w:p>
       <w:pPr>
-        <w:rPr>
-          <w:rFonts w:ascii="Times New Roman" w:hAnsi="Times New Roman" w:cs="Times New Roman"/>
-          <w:sz w:val="26"/>
-          <w:szCs w:val="26"/>
-        </w:rPr>
-      </w:pPr>
-    </w:p>
-    <w:p>
-      <w:pPr>
         <w:pStyle w:val="Heading1"/>
         <w:rPr>
           <w:szCs w:val="26"/>
         </w:rPr>
       </w:pPr>
+      <w:bookmarkStart w:id="1" w:name="_Toc240391344"/>
       <w:r>
         <w:rPr>
           <w:szCs w:val="26"/>
         </w:rPr>
         <w:t>2. Kết quả tổng hợp theo module</w:t>
       </w:r>
+      <w:bookmarkEnd w:id="1"/>
     </w:p>
     <w:tbl>
       <w:tblPr>
@@ -315,6 +1502,7 @@
           </w:tcPr>
           <w:p>
             <w:pPr>
+              <w:spacing w:after="160" w:line="259" w:lineRule="auto"/>
               <w:rPr>
                 <w:rFonts w:ascii="Times New Roman" w:hAnsi="Times New Roman" w:cs="Times New Roman"/>
                 <w:sz w:val="26"/>
@@ -338,6 +1526,7 @@
           </w:tcPr>
           <w:p>
             <w:pPr>
+              <w:spacing w:after="160" w:line="259" w:lineRule="auto"/>
               <w:rPr>
                 <w:rFonts w:ascii="Times New Roman" w:hAnsi="Times New Roman" w:cs="Times New Roman"/>
                 <w:sz w:val="26"/>
@@ -361,6 +1550,7 @@
           </w:tcPr>
           <w:p>
             <w:pPr>
+              <w:spacing w:after="160" w:line="259" w:lineRule="auto"/>
               <w:rPr>
                 <w:rFonts w:ascii="Times New Roman" w:hAnsi="Times New Roman" w:cs="Times New Roman"/>
                 <w:sz w:val="26"/>
@@ -386,6 +1576,7 @@
           </w:tcPr>
           <w:p>
             <w:pPr>
+              <w:spacing w:after="160" w:line="259" w:lineRule="auto"/>
               <w:rPr>
                 <w:rFonts w:ascii="Times New Roman" w:hAnsi="Times New Roman" w:cs="Times New Roman"/>
                 <w:sz w:val="26"/>
@@ -409,6 +1600,7 @@
           </w:tcPr>
           <w:p>
             <w:pPr>
+              <w:spacing w:after="160" w:line="259" w:lineRule="auto"/>
               <w:rPr>
                 <w:rFonts w:ascii="Times New Roman" w:hAnsi="Times New Roman" w:cs="Times New Roman"/>
                 <w:sz w:val="26"/>
@@ -432,6 +1624,7 @@
           </w:tcPr>
           <w:p>
             <w:pPr>
+              <w:spacing w:after="160" w:line="259" w:lineRule="auto"/>
               <w:rPr>
                 <w:rFonts w:ascii="Times New Roman" w:hAnsi="Times New Roman" w:cs="Times New Roman"/>
                 <w:sz w:val="26"/>
@@ -457,6 +1650,7 @@
           </w:tcPr>
           <w:p>
             <w:pPr>
+              <w:spacing w:after="160" w:line="259" w:lineRule="auto"/>
               <w:rPr>
                 <w:rFonts w:ascii="Times New Roman" w:hAnsi="Times New Roman" w:cs="Times New Roman"/>
                 <w:sz w:val="26"/>
@@ -480,6 +1674,7 @@
           </w:tcPr>
           <w:p>
             <w:pPr>
+              <w:spacing w:after="160" w:line="259" w:lineRule="auto"/>
               <w:rPr>
                 <w:rFonts w:ascii="Times New Roman" w:hAnsi="Times New Roman" w:cs="Times New Roman"/>
                 <w:sz w:val="26"/>
@@ -503,6 +1698,7 @@
           </w:tcPr>
           <w:p>
             <w:pPr>
+              <w:spacing w:after="160" w:line="259" w:lineRule="auto"/>
               <w:rPr>
                 <w:rFonts w:ascii="Times New Roman" w:hAnsi="Times New Roman" w:cs="Times New Roman"/>
                 <w:sz w:val="26"/>
@@ -528,6 +1724,7 @@
           </w:tcPr>
           <w:p>
             <w:pPr>
+              <w:spacing w:after="160" w:line="259" w:lineRule="auto"/>
               <w:rPr>
                 <w:rFonts w:ascii="Times New Roman" w:hAnsi="Times New Roman" w:cs="Times New Roman"/>
                 <w:sz w:val="26"/>
@@ -551,6 +1748,7 @@
           </w:tcPr>
           <w:p>
             <w:pPr>
+              <w:spacing w:after="160" w:line="259" w:lineRule="auto"/>
               <w:rPr>
                 <w:rFonts w:ascii="Times New Roman" w:hAnsi="Times New Roman" w:cs="Times New Roman"/>
                 <w:sz w:val="26"/>
@@ -574,6 +1772,7 @@
           </w:tcPr>
           <w:p>
             <w:pPr>
+              <w:spacing w:after="160" w:line="259" w:lineRule="auto"/>
               <w:rPr>
                 <w:rFonts w:ascii="Times New Roman" w:hAnsi="Times New Roman" w:cs="Times New Roman"/>
                 <w:sz w:val="26"/>
@@ -599,6 +1798,7 @@
           </w:tcPr>
           <w:p>
             <w:pPr>
+              <w:spacing w:after="160" w:line="259" w:lineRule="auto"/>
               <w:rPr>
                 <w:rFonts w:ascii="Times New Roman" w:hAnsi="Times New Roman" w:cs="Times New Roman"/>
                 <w:sz w:val="26"/>
@@ -622,6 +1822,7 @@
           </w:tcPr>
           <w:p>
             <w:pPr>
+              <w:spacing w:after="160" w:line="259" w:lineRule="auto"/>
               <w:rPr>
                 <w:rFonts w:ascii="Times New Roman" w:hAnsi="Times New Roman" w:cs="Times New Roman"/>
                 <w:sz w:val="26"/>
@@ -645,6 +1846,7 @@
           </w:tcPr>
           <w:p>
             <w:pPr>
+              <w:spacing w:after="160" w:line="259" w:lineRule="auto"/>
               <w:rPr>
                 <w:rFonts w:ascii="Times New Roman" w:hAnsi="Times New Roman" w:cs="Times New Roman"/>
                 <w:sz w:val="26"/>
@@ -670,6 +1872,7 @@
           </w:tcPr>
           <w:p>
             <w:pPr>
+              <w:spacing w:after="160" w:line="259" w:lineRule="auto"/>
               <w:rPr>
                 <w:rFonts w:ascii="Times New Roman" w:hAnsi="Times New Roman" w:cs="Times New Roman"/>
                 <w:sz w:val="26"/>
@@ -693,6 +1896,7 @@
           </w:tcPr>
           <w:p>
             <w:pPr>
+              <w:spacing w:after="160" w:line="259" w:lineRule="auto"/>
               <w:rPr>
                 <w:rFonts w:ascii="Times New Roman" w:hAnsi="Times New Roman" w:cs="Times New Roman"/>
                 <w:sz w:val="26"/>
@@ -732,6 +1936,7 @@
           </w:tcPr>
           <w:p>
             <w:pPr>
+              <w:spacing w:after="160" w:line="259" w:lineRule="auto"/>
               <w:rPr>
                 <w:rFonts w:ascii="Times New Roman" w:hAnsi="Times New Roman" w:cs="Times New Roman"/>
                 <w:sz w:val="26"/>
@@ -757,6 +1962,7 @@
           </w:tcPr>
           <w:p>
             <w:pPr>
+              <w:spacing w:after="160" w:line="259" w:lineRule="auto"/>
               <w:rPr>
                 <w:rFonts w:ascii="Times New Roman" w:hAnsi="Times New Roman" w:cs="Times New Roman"/>
                 <w:sz w:val="26"/>
@@ -780,6 +1986,7 @@
           </w:tcPr>
           <w:p>
             <w:pPr>
+              <w:spacing w:after="160" w:line="259" w:lineRule="auto"/>
               <w:rPr>
                 <w:rFonts w:ascii="Times New Roman" w:hAnsi="Times New Roman" w:cs="Times New Roman"/>
                 <w:sz w:val="26"/>
@@ -795,6 +2002,7 @@
           </w:tcPr>
           <w:p>
             <w:pPr>
+              <w:spacing w:after="160" w:line="259" w:lineRule="auto"/>
               <w:rPr>
                 <w:rFonts w:ascii="Times New Roman" w:hAnsi="Times New Roman" w:cs="Times New Roman"/>
                 <w:sz w:val="26"/>
@@ -829,12 +2037,14 @@
           <w:szCs w:val="26"/>
         </w:rPr>
       </w:pPr>
+      <w:bookmarkStart w:id="2" w:name="_Toc240391345"/>
       <w:r>
         <w:rPr>
           <w:szCs w:val="26"/>
         </w:rPr>
         <w:t>3. Danh sách Bug theo mức độ</w:t>
       </w:r>
+      <w:bookmarkEnd w:id="2"/>
     </w:p>
     <w:tbl>
       <w:tblPr>
@@ -855,10 +2065,9 @@
           </w:tcPr>
           <w:p>
             <w:pPr>
-              <w:jc w:val="center"/>
-              <w:rPr>
-                <w:rFonts w:ascii="Times New Roman" w:hAnsi="Times New Roman" w:cs="Times New Roman"/>
-                <w:b/>
+              <w:spacing w:after="160" w:line="259" w:lineRule="auto"/>
+              <w:rPr>
+                <w:rFonts w:ascii="Times New Roman" w:hAnsi="Times New Roman" w:cs="Times New Roman"/>
                 <w:sz w:val="26"/>
                 <w:szCs w:val="26"/>
               </w:rPr>
@@ -866,11 +2075,9 @@
             <w:r>
               <w:rPr>
                 <w:rFonts w:ascii="Times New Roman" w:hAnsi="Times New Roman" w:cs="Times New Roman"/>
-                <w:b/>
-                <w:sz w:val="26"/>
-                <w:szCs w:val="26"/>
-              </w:rPr>
-              <w:lastRenderedPageBreak/>
+                <w:sz w:val="26"/>
+                <w:szCs w:val="26"/>
+              </w:rPr>
               <w:t>Mức độ</w:t>
             </w:r>
           </w:p>
@@ -882,10 +2089,9 @@
           </w:tcPr>
           <w:p>
             <w:pPr>
-              <w:jc w:val="center"/>
-              <w:rPr>
-                <w:rFonts w:ascii="Times New Roman" w:hAnsi="Times New Roman" w:cs="Times New Roman"/>
-                <w:b/>
+              <w:spacing w:after="160" w:line="259" w:lineRule="auto"/>
+              <w:rPr>
+                <w:rFonts w:ascii="Times New Roman" w:hAnsi="Times New Roman" w:cs="Times New Roman"/>
                 <w:sz w:val="26"/>
                 <w:szCs w:val="26"/>
               </w:rPr>
@@ -893,7 +2099,6 @@
             <w:r>
               <w:rPr>
                 <w:rFonts w:ascii="Times New Roman" w:hAnsi="Times New Roman" w:cs="Times New Roman"/>
-                <w:b/>
                 <w:sz w:val="26"/>
                 <w:szCs w:val="26"/>
               </w:rPr>
@@ -908,10 +2113,9 @@
           </w:tcPr>
           <w:p>
             <w:pPr>
-              <w:jc w:val="center"/>
-              <w:rPr>
-                <w:rFonts w:ascii="Times New Roman" w:hAnsi="Times New Roman" w:cs="Times New Roman"/>
-                <w:b/>
+              <w:spacing w:after="160" w:line="259" w:lineRule="auto"/>
+              <w:rPr>
+                <w:rFonts w:ascii="Times New Roman" w:hAnsi="Times New Roman" w:cs="Times New Roman"/>
                 <w:sz w:val="26"/>
                 <w:szCs w:val="26"/>
               </w:rPr>
@@ -919,7 +2123,6 @@
             <w:r>
               <w:rPr>
                 <w:rFonts w:ascii="Times New Roman" w:hAnsi="Times New Roman" w:cs="Times New Roman"/>
-                <w:b/>
                 <w:sz w:val="26"/>
                 <w:szCs w:val="26"/>
               </w:rPr>
@@ -936,6 +2139,7 @@
           </w:tcPr>
           <w:p>
             <w:pPr>
+              <w:spacing w:after="160" w:line="259" w:lineRule="auto"/>
               <w:rPr>
                 <w:rFonts w:ascii="Times New Roman" w:hAnsi="Times New Roman" w:cs="Times New Roman"/>
                 <w:sz w:val="26"/>
@@ -948,6 +2152,7 @@
                 <w:sz w:val="26"/>
                 <w:szCs w:val="26"/>
               </w:rPr>
+              <w:lastRenderedPageBreak/>
               <w:t>Cao / TB / Thấp</w:t>
             </w:r>
           </w:p>
@@ -959,6 +2164,7 @@
           </w:tcPr>
           <w:p>
             <w:pPr>
+              <w:spacing w:after="160" w:line="259" w:lineRule="auto"/>
               <w:rPr>
                 <w:rFonts w:ascii="Times New Roman" w:hAnsi="Times New Roman" w:cs="Times New Roman"/>
                 <w:sz w:val="26"/>
@@ -982,6 +2188,7 @@
           </w:tcPr>
           <w:p>
             <w:pPr>
+              <w:spacing w:after="160" w:line="259" w:lineRule="auto"/>
               <w:rPr>
                 <w:rFonts w:ascii="Times New Roman" w:hAnsi="Times New Roman" w:cs="Times New Roman"/>
                 <w:sz w:val="26"/>
@@ -1016,15 +2223,18 @@
           <w:szCs w:val="26"/>
         </w:rPr>
       </w:pPr>
+      <w:bookmarkStart w:id="3" w:name="_Toc240391346"/>
       <w:r>
         <w:rPr>
           <w:szCs w:val="26"/>
         </w:rPr>
         <w:t>4. Kết quả Unit Test</w:t>
       </w:r>
-    </w:p>
-    <w:p>
-      <w:pPr>
+      <w:bookmarkEnd w:id="3"/>
+    </w:p>
+    <w:p>
+      <w:pPr>
+        <w:jc w:val="both"/>
         <w:rPr>
           <w:rFonts w:ascii="Times New Roman" w:hAnsi="Times New Roman" w:cs="Times New Roman"/>
           <w:sz w:val="26"/>
@@ -1042,6 +2252,7 @@
     </w:p>
     <w:p>
       <w:pPr>
+        <w:jc w:val="both"/>
         <w:rPr>
           <w:rFonts w:ascii="Times New Roman" w:hAnsi="Times New Roman" w:cs="Times New Roman"/>
           <w:sz w:val="26"/>
@@ -1059,6 +2270,7 @@
     </w:p>
     <w:p>
       <w:pPr>
+        <w:jc w:val="both"/>
         <w:rPr>
           <w:rFonts w:ascii="Times New Roman" w:hAnsi="Times New Roman" w:cs="Times New Roman"/>
           <w:sz w:val="26"/>
@@ -1076,6 +2288,7 @@
     </w:p>
     <w:p>
       <w:pPr>
+        <w:jc w:val="both"/>
         <w:rPr>
           <w:rFonts w:ascii="Times New Roman" w:hAnsi="Times New Roman" w:cs="Times New Roman"/>
           <w:sz w:val="26"/>
@@ -1107,15 +2320,18 @@
           <w:szCs w:val="26"/>
         </w:rPr>
       </w:pPr>
+      <w:bookmarkStart w:id="4" w:name="_Toc240391347"/>
       <w:r>
         <w:rPr>
           <w:szCs w:val="26"/>
         </w:rPr>
         <w:t>5. Kết quả CodeceptJS (E2E Automation)</w:t>
       </w:r>
-    </w:p>
-    <w:p>
-      <w:pPr>
+      <w:bookmarkEnd w:id="4"/>
+    </w:p>
+    <w:p>
+      <w:pPr>
+        <w:jc w:val="both"/>
         <w:rPr>
           <w:rFonts w:ascii="Times New Roman" w:hAnsi="Times New Roman" w:cs="Times New Roman"/>
           <w:sz w:val="26"/>
@@ -1133,6 +2349,7 @@
     </w:p>
     <w:p>
       <w:pPr>
+        <w:jc w:val="both"/>
         <w:rPr>
           <w:rFonts w:ascii="Times New Roman" w:hAnsi="Times New Roman" w:cs="Times New Roman"/>
           <w:sz w:val="26"/>
@@ -1150,6 +2367,7 @@
     </w:p>
     <w:p>
       <w:pPr>
+        <w:jc w:val="both"/>
         <w:rPr>
           <w:rFonts w:ascii="Times New Roman" w:hAnsi="Times New Roman" w:cs="Times New Roman"/>
           <w:sz w:val="26"/>
@@ -1181,6 +2399,7 @@
           <w:szCs w:val="26"/>
         </w:rPr>
       </w:pPr>
+      <w:bookmarkStart w:id="5" w:name="_Toc240391348"/>
       <w:r>
         <w:rPr>
           <w:szCs w:val="26"/>
@@ -1193,9 +2412,11 @@
         </w:rPr>
         <w:t>+ Kết luận</w:t>
       </w:r>
-    </w:p>
-    <w:p>
-      <w:pPr>
+      <w:bookmarkEnd w:id="5"/>
+    </w:p>
+    <w:p>
+      <w:pPr>
+        <w:jc w:val="both"/>
         <w:rPr>
           <w:rFonts w:ascii="Times New Roman" w:hAnsi="Times New Roman" w:cs="Times New Roman"/>
           <w:sz w:val="26"/>
@@ -1213,6 +2434,7 @@
     </w:p>
     <w:p>
       <w:pPr>
+        <w:jc w:val="both"/>
         <w:rPr>
           <w:rFonts w:ascii="Times New Roman" w:hAnsi="Times New Roman" w:cs="Times New Roman"/>
           <w:sz w:val="26"/>
@@ -1230,6 +2452,7 @@
     </w:p>
     <w:p>
       <w:pPr>
+        <w:jc w:val="both"/>
         <w:rPr>
           <w:rFonts w:ascii="Times New Roman" w:hAnsi="Times New Roman" w:cs="Times New Roman"/>
           <w:sz w:val="26"/>
@@ -1246,13 +2469,134 @@
       </w:r>
     </w:p>
     <w:sectPr>
+      <w:footerReference w:type="default" r:id="rId10"/>
       <w:pgSz w:w="12240" w:h="15840"/>
       <w:pgMar w:top="1440" w:right="1440" w:bottom="1440" w:left="1440" w:header="720" w:footer="720" w:gutter="0"/>
+      <w:pgNumType w:start="1"/>
       <w:cols w:space="720"/>
       <w:docGrid w:linePitch="360"/>
     </w:sectPr>
   </w:body>
 </w:document>
+</file>
+
+<file path=word/endnotes.xml><?xml version="1.0" encoding="utf-8"?>
+<w:endnotes xmlns:wpc="http://schemas.microsoft.com/office/word/2010/wordprocessingCanvas" xmlns:cx="http://schemas.microsoft.com/office/drawing/2014/chartex" xmlns:cx1="http://schemas.microsoft.com/office/drawing/2015/9/8/chartex" xmlns:cx2="http://schemas.microsoft.com/office/drawing/2015/10/21/chartex" xmlns:cx3="http://schemas.microsoft.com/office/drawing/2016/5/9/chartex" xmlns:cx4="http://schemas.microsoft.com/office/drawing/2016/5/10/chartex" xmlns:cx5="http://schemas.microsoft.com/office/drawing/2016/5/11/chartex" xmlns:cx6="http://schemas.microsoft.com/office/drawing/2016/5/12/chartex" xmlns:cx7="http://schemas.microsoft.com/office/drawing/2016/5/13/chartex" xmlns:cx8="http://schemas.microsoft.com/office/drawing/2016/5/14/chartex" xmlns:mc="http://schemas.openxmlformats.org/markup-compatibility/2006" xmlns:aink="http://schemas.microsoft.com/office/drawing/2016/ink" xmlns:am3d="http://schemas.microsoft.com/office/drawing/2017/model3d" xmlns:o="urn:schemas-microsoft-com:office:office" xmlns:oel="http://schemas.microsoft.com/office/2019/extlst" xmlns:r="http://schemas.openxmlformats.org/officeDocument/2006/relationships" xmlns:m="http://schemas.openxmlformats.org/officeDocument/2006/math" xmlns:v="urn:schemas-microsoft-com:vml" xmlns:wp14="http://schemas.microsoft.com/office/word/2010/wordprocessingDrawing" xmlns:wp="http://schemas.openxmlformats.org/drawingml/2006/wordprocessingDrawing" xmlns:w10="urn:schemas-microsoft-com:office:word" xmlns:w="http://schemas.openxmlformats.org/wordprocessingml/2006/main" xmlns:w14="http://schemas.microsoft.com/office/word/2010/wordml" xmlns:w15="http://schemas.microsoft.com/office/word/2012/wordml" xmlns:w16cex="http://schemas.microsoft.com/office/word/2018/wordml/cex" xmlns:w16cid="http://schemas.microsoft.com/office/word/2016/wordml/cid" xmlns:w16="http://schemas.microsoft.com/office/word/2018/wordml" xmlns:w16du="http://schemas.microsoft.com/office/word/2023/wordml/word16du" xmlns:w16sdtdh="http://schemas.microsoft.com/office/word/2020/wordml/sdtdatahash" xmlns:w16sdtfl="http://schemas.microsoft.com/office/word/2024/wordml/sdtformatlock" xmlns:w16se="http://schemas.microsoft.com/office/word/2015/wordml/symex" xmlns:wpg="http://schemas.microsoft.com/office/word/2010/wordprocessingGroup" xmlns:wpi="http://schemas.microsoft.com/office/word/2010/wordprocessingInk" xmlns:wne="http://schemas.microsoft.com/office/word/2006/wordml" xmlns:wps="http://schemas.microsoft.com/office/word/2010/wordprocessingShape" mc:Ignorable="w14 w15 w16se w16cid w16 w16cex w16sdtdh w16sdtfl w16du wp14">
+  <w:endnote w:type="separator" w:id="-1">
+    <w:p>
+      <w:pPr>
+        <w:spacing w:after="0" w:line="240" w:lineRule="auto"/>
+      </w:pPr>
+      <w:r>
+        <w:separator/>
+      </w:r>
+    </w:p>
+  </w:endnote>
+  <w:endnote w:type="continuationSeparator" w:id="0">
+    <w:p>
+      <w:pPr>
+        <w:spacing w:after="0" w:line="240" w:lineRule="auto"/>
+      </w:pPr>
+      <w:r>
+        <w:continuationSeparator/>
+      </w:r>
+    </w:p>
+  </w:endnote>
+</w:endnotes>
+</file>
+
+<file path=word/footer1.xml><?xml version="1.0" encoding="utf-8"?>
+<w:ftr xmlns:wpc="http://schemas.microsoft.com/office/word/2010/wordprocessingCanvas" xmlns:cx="http://schemas.microsoft.com/office/drawing/2014/chartex" xmlns:cx1="http://schemas.microsoft.com/office/drawing/2015/9/8/chartex" xmlns:cx2="http://schemas.microsoft.com/office/drawing/2015/10/21/chartex" xmlns:cx3="http://schemas.microsoft.com/office/drawing/2016/5/9/chartex" xmlns:cx4="http://schemas.microsoft.com/office/drawing/2016/5/10/chartex" xmlns:cx5="http://schemas.microsoft.com/office/drawing/2016/5/11/chartex" xmlns:cx6="http://schemas.microsoft.com/office/drawing/2016/5/12/chartex" xmlns:cx7="http://schemas.microsoft.com/office/drawing/2016/5/13/chartex" xmlns:cx8="http://schemas.microsoft.com/office/drawing/2016/5/14/chartex" xmlns:mc="http://schemas.openxmlformats.org/markup-compatibility/2006" xmlns:aink="http://schemas.microsoft.com/office/drawing/2016/ink" xmlns:am3d="http://schemas.microsoft.com/office/drawing/2017/model3d" xmlns:o="urn:schemas-microsoft-com:office:office" xmlns:oel="http://schemas.microsoft.com/office/2019/extlst" xmlns:r="http://schemas.openxmlformats.org/officeDocument/2006/relationships" xmlns:m="http://schemas.openxmlformats.org/officeDocument/2006/math" xmlns:v="urn:schemas-microsoft-com:vml" xmlns:wp14="http://schemas.microsoft.com/office/word/2010/wordprocessingDrawing" xmlns:wp="http://schemas.openxmlformats.org/drawingml/2006/wordprocessingDrawing" xmlns:w10="urn:schemas-microsoft-com:office:word" xmlns:w="http://schemas.openxmlformats.org/wordprocessingml/2006/main" xmlns:w14="http://schemas.microsoft.com/office/word/2010/wordml" xmlns:w15="http://schemas.microsoft.com/office/word/2012/wordml" xmlns:w16cex="http://schemas.microsoft.com/office/word/2018/wordml/cex" xmlns:w16cid="http://schemas.microsoft.com/office/word/2016/wordml/cid" xmlns:w16="http://schemas.microsoft.com/office/word/2018/wordml" xmlns:w16du="http://schemas.microsoft.com/office/word/2023/wordml/word16du" xmlns:w16sdtdh="http://schemas.microsoft.com/office/word/2020/wordml/sdtdatahash" xmlns:w16sdtfl="http://schemas.microsoft.com/office/word/2024/wordml/sdtformatlock" xmlns:w16se="http://schemas.microsoft.com/office/word/2015/wordml/symex" xmlns:wpg="http://schemas.microsoft.com/office/word/2010/wordprocessingGroup" xmlns:wpi="http://schemas.microsoft.com/office/word/2010/wordprocessingInk" xmlns:wne="http://schemas.microsoft.com/office/word/2006/wordml" xmlns:wps="http://schemas.microsoft.com/office/word/2010/wordprocessingShape" mc:Ignorable="w14 w15 w16se w16cid w16 w16cex w16sdtdh w16sdtfl w16du wp14">
+  <w:p>
+    <w:pPr>
+      <w:pStyle w:val="Footer"/>
+      <w:jc w:val="center"/>
+    </w:pPr>
+  </w:p>
+  <w:p>
+    <w:pPr>
+      <w:pStyle w:val="Footer"/>
+    </w:pPr>
+  </w:p>
+</w:ftr>
+</file>
+
+<file path=word/footer2.xml><?xml version="1.0" encoding="utf-8"?>
+<w:ftr xmlns:wpc="http://schemas.microsoft.com/office/word/2010/wordprocessingCanvas" xmlns:cx="http://schemas.microsoft.com/office/drawing/2014/chartex" xmlns:cx1="http://schemas.microsoft.com/office/drawing/2015/9/8/chartex" xmlns:cx2="http://schemas.microsoft.com/office/drawing/2015/10/21/chartex" xmlns:cx3="http://schemas.microsoft.com/office/drawing/2016/5/9/chartex" xmlns:cx4="http://schemas.microsoft.com/office/drawing/2016/5/10/chartex" xmlns:cx5="http://schemas.microsoft.com/office/drawing/2016/5/11/chartex" xmlns:cx6="http://schemas.microsoft.com/office/drawing/2016/5/12/chartex" xmlns:cx7="http://schemas.microsoft.com/office/drawing/2016/5/13/chartex" xmlns:cx8="http://schemas.microsoft.com/office/drawing/2016/5/14/chartex" xmlns:mc="http://schemas.openxmlformats.org/markup-compatibility/2006" xmlns:aink="http://schemas.microsoft.com/office/drawing/2016/ink" xmlns:am3d="http://schemas.microsoft.com/office/drawing/2017/model3d" xmlns:o="urn:schemas-microsoft-com:office:office" xmlns:oel="http://schemas.microsoft.com/office/2019/extlst" xmlns:r="http://schemas.openxmlformats.org/officeDocument/2006/relationships" xmlns:m="http://schemas.openxmlformats.org/officeDocument/2006/math" xmlns:v="urn:schemas-microsoft-com:vml" xmlns:wp14="http://schemas.microsoft.com/office/word/2010/wordprocessingDrawing" xmlns:wp="http://schemas.openxmlformats.org/drawingml/2006/wordprocessingDrawing" xmlns:w10="urn:schemas-microsoft-com:office:word" xmlns:w="http://schemas.openxmlformats.org/wordprocessingml/2006/main" xmlns:w14="http://schemas.microsoft.com/office/word/2010/wordml" xmlns:w15="http://schemas.microsoft.com/office/word/2012/wordml" xmlns:w16cex="http://schemas.microsoft.com/office/word/2018/wordml/cex" xmlns:w16cid="http://schemas.microsoft.com/office/word/2016/wordml/cid" xmlns:w16="http://schemas.microsoft.com/office/word/2018/wordml" xmlns:w16du="http://schemas.microsoft.com/office/word/2023/wordml/word16du" xmlns:w16sdtdh="http://schemas.microsoft.com/office/word/2020/wordml/sdtdatahash" xmlns:w16sdtfl="http://schemas.microsoft.com/office/word/2024/wordml/sdtformatlock" xmlns:w16se="http://schemas.microsoft.com/office/word/2015/wordml/symex" xmlns:wpg="http://schemas.microsoft.com/office/word/2010/wordprocessingGroup" xmlns:wpi="http://schemas.microsoft.com/office/word/2010/wordprocessingInk" xmlns:wne="http://schemas.microsoft.com/office/word/2006/wordml" xmlns:wps="http://schemas.microsoft.com/office/word/2010/wordprocessingShape" mc:Ignorable="w14 w15 w16se w16cid w16 w16cex w16sdtdh w16sdtfl w16du wp14">
+  <w:sdt>
+    <w:sdtPr>
+      <w:id w:val="1605767122"/>
+      <w:docPartObj>
+        <w:docPartGallery w:val="Page Numbers (Bottom of Page)"/>
+        <w:docPartUnique/>
+      </w:docPartObj>
+    </w:sdtPr>
+    <w:sdtEndPr>
+      <w:rPr>
+        <w:noProof/>
+      </w:rPr>
+    </w:sdtEndPr>
+    <w:sdtContent>
+      <w:p>
+        <w:pPr>
+          <w:pStyle w:val="Footer"/>
+          <w:jc w:val="center"/>
+        </w:pPr>
+        <w:r>
+          <w:fldChar w:fldCharType="begin"/>
+        </w:r>
+        <w:r>
+          <w:instrText xml:space="preserve"> PAGE   \* MERGEFORMAT </w:instrText>
+        </w:r>
+        <w:r>
+          <w:fldChar w:fldCharType="separate"/>
+        </w:r>
+        <w:r>
+          <w:rPr>
+            <w:noProof/>
+          </w:rPr>
+          <w:t>2</w:t>
+        </w:r>
+        <w:r>
+          <w:rPr>
+            <w:noProof/>
+          </w:rPr>
+          <w:fldChar w:fldCharType="end"/>
+        </w:r>
+      </w:p>
+    </w:sdtContent>
+  </w:sdt>
+  <w:p>
+    <w:pPr>
+      <w:pStyle w:val="Footer"/>
+    </w:pPr>
+  </w:p>
+</w:ftr>
+</file>
+
+<file path=word/footnotes.xml><?xml version="1.0" encoding="utf-8"?>
+<w:footnotes xmlns:wpc="http://schemas.microsoft.com/office/word/2010/wordprocessingCanvas" xmlns:cx="http://schemas.microsoft.com/office/drawing/2014/chartex" xmlns:cx1="http://schemas.microsoft.com/office/drawing/2015/9/8/chartex" xmlns:cx2="http://schemas.microsoft.com/office/drawing/2015/10/21/chartex" xmlns:cx3="http://schemas.microsoft.com/office/drawing/2016/5/9/chartex" xmlns:cx4="http://schemas.microsoft.com/office/drawing/2016/5/10/chartex" xmlns:cx5="http://schemas.microsoft.com/office/drawing/2016/5/11/chartex" xmlns:cx6="http://schemas.microsoft.com/office/drawing/2016/5/12/chartex" xmlns:cx7="http://schemas.microsoft.com/office/drawing/2016/5/13/chartex" xmlns:cx8="http://schemas.microsoft.com/office/drawing/2016/5/14/chartex" xmlns:mc="http://schemas.openxmlformats.org/markup-compatibility/2006" xmlns:aink="http://schemas.microsoft.com/office/drawing/2016/ink" xmlns:am3d="http://schemas.microsoft.com/office/drawing/2017/model3d" xmlns:o="urn:schemas-microsoft-com:office:office" xmlns:oel="http://schemas.microsoft.com/office/2019/extlst" xmlns:r="http://schemas.openxmlformats.org/officeDocument/2006/relationships" xmlns:m="http://schemas.openxmlformats.org/officeDocument/2006/math" xmlns:v="urn:schemas-microsoft-com:vml" xmlns:wp14="http://schemas.microsoft.com/office/word/2010/wordprocessingDrawing" xmlns:wp="http://schemas.openxmlformats.org/drawingml/2006/wordprocessingDrawing" xmlns:w10="urn:schemas-microsoft-com:office:word" xmlns:w="http://schemas.openxmlformats.org/wordprocessingml/2006/main" xmlns:w14="http://schemas.microsoft.com/office/word/2010/wordml" xmlns:w15="http://schemas.microsoft.com/office/word/2012/wordml" xmlns:w16cex="http://schemas.microsoft.com/office/word/2018/wordml/cex" xmlns:w16cid="http://schemas.microsoft.com/office/word/2016/wordml/cid" xmlns:w16="http://schemas.microsoft.com/office/word/2018/wordml" xmlns:w16du="http://schemas.microsoft.com/office/word/2023/wordml/word16du" xmlns:w16sdtdh="http://schemas.microsoft.com/office/word/2020/wordml/sdtdatahash" xmlns:w16sdtfl="http://schemas.microsoft.com/office/word/2024/wordml/sdtformatlock" xmlns:w16se="http://schemas.microsoft.com/office/word/2015/wordml/symex" xmlns:wpg="http://schemas.microsoft.com/office/word/2010/wordprocessingGroup" xmlns:wpi="http://schemas.microsoft.com/office/word/2010/wordprocessingInk" xmlns:wne="http://schemas.microsoft.com/office/word/2006/wordml" xmlns:wps="http://schemas.microsoft.com/office/word/2010/wordprocessingShape" mc:Ignorable="w14 w15 w16se w16cid w16 w16cex w16sdtdh w16sdtfl w16du wp14">
+  <w:footnote w:type="separator" w:id="-1">
+    <w:p>
+      <w:pPr>
+        <w:spacing w:after="0" w:line="240" w:lineRule="auto"/>
+      </w:pPr>
+      <w:r>
+        <w:separator/>
+      </w:r>
+    </w:p>
+  </w:footnote>
+  <w:footnote w:type="continuationSeparator" w:id="0">
+    <w:p>
+      <w:pPr>
+        <w:spacing w:after="0" w:line="240" w:lineRule="auto"/>
+      </w:pPr>
+      <w:r>
+        <w:continuationSeparator/>
+      </w:r>
+    </w:p>
+  </w:footnote>
+</w:footnotes>
 </file>
 
 <file path=word/numbering.xml><?xml version="1.0" encoding="utf-8"?>
@@ -2328,7 +3672,6 @@
   <w:style w:type="character" w:default="1" w:styleId="DefaultParagraphFont">
     <w:name w:val="Default Paragraph Font"/>
     <w:uiPriority w:val="1"/>
-    <w:semiHidden/>
     <w:unhideWhenUsed/>
   </w:style>
   <w:style w:type="table" w:default="1" w:styleId="TableNormal">
@@ -2463,6 +3806,97 @@
         <w:insideV w:val="single" w:sz="4" w:space="0" w:color="auto"/>
       </w:tblBorders>
     </w:tblPr>
+  </w:style>
+  <w:style w:type="paragraph" w:styleId="TOCHeading">
+    <w:name w:val="TOC Heading"/>
+    <w:basedOn w:val="Heading1"/>
+    <w:next w:val="Normal"/>
+    <w:uiPriority w:val="39"/>
+    <w:unhideWhenUsed/>
+    <w:qFormat/>
+    <w:rsid w:val="00F15B93"/>
+    <w:pPr>
+      <w:keepNext/>
+      <w:keepLines/>
+      <w:spacing w:before="240" w:beforeAutospacing="0" w:after="0" w:afterAutospacing="0" w:line="259" w:lineRule="auto"/>
+      <w:outlineLvl w:val="9"/>
+    </w:pPr>
+    <w:rPr>
+      <w:rFonts w:asciiTheme="majorHAnsi" w:eastAsiaTheme="majorEastAsia" w:hAnsiTheme="majorHAnsi" w:cstheme="majorBidi"/>
+      <w:b w:val="0"/>
+      <w:bCs w:val="0"/>
+      <w:color w:val="2F5496" w:themeColor="accent1" w:themeShade="BF"/>
+      <w:kern w:val="0"/>
+      <w:sz w:val="32"/>
+      <w:szCs w:val="32"/>
+    </w:rPr>
+  </w:style>
+  <w:style w:type="paragraph" w:styleId="TOC1">
+    <w:name w:val="toc 1"/>
+    <w:basedOn w:val="Normal"/>
+    <w:next w:val="Normal"/>
+    <w:autoRedefine/>
+    <w:uiPriority w:val="39"/>
+    <w:unhideWhenUsed/>
+    <w:rsid w:val="00F15B93"/>
+    <w:pPr>
+      <w:spacing w:after="100"/>
+    </w:pPr>
+  </w:style>
+  <w:style w:type="character" w:styleId="Hyperlink">
+    <w:name w:val="Hyperlink"/>
+    <w:basedOn w:val="DefaultParagraphFont"/>
+    <w:uiPriority w:val="99"/>
+    <w:unhideWhenUsed/>
+    <w:rsid w:val="00F15B93"/>
+    <w:rPr>
+      <w:color w:val="0563C1" w:themeColor="hyperlink"/>
+      <w:u w:val="single"/>
+    </w:rPr>
+  </w:style>
+  <w:style w:type="paragraph" w:styleId="Header">
+    <w:name w:val="header"/>
+    <w:basedOn w:val="Normal"/>
+    <w:link w:val="HeaderChar"/>
+    <w:uiPriority w:val="99"/>
+    <w:unhideWhenUsed/>
+    <w:rsid w:val="00F15B93"/>
+    <w:pPr>
+      <w:tabs>
+        <w:tab w:val="center" w:pos="4513"/>
+        <w:tab w:val="right" w:pos="9026"/>
+      </w:tabs>
+      <w:spacing w:after="0" w:line="240" w:lineRule="auto"/>
+    </w:pPr>
+  </w:style>
+  <w:style w:type="character" w:customStyle="1" w:styleId="HeaderChar">
+    <w:name w:val="Header Char"/>
+    <w:basedOn w:val="DefaultParagraphFont"/>
+    <w:link w:val="Header"/>
+    <w:uiPriority w:val="99"/>
+    <w:rsid w:val="00F15B93"/>
+  </w:style>
+  <w:style w:type="paragraph" w:styleId="Footer">
+    <w:name w:val="footer"/>
+    <w:basedOn w:val="Normal"/>
+    <w:link w:val="FooterChar"/>
+    <w:uiPriority w:val="99"/>
+    <w:unhideWhenUsed/>
+    <w:rsid w:val="00F15B93"/>
+    <w:pPr>
+      <w:tabs>
+        <w:tab w:val="center" w:pos="4513"/>
+        <w:tab w:val="right" w:pos="9026"/>
+      </w:tabs>
+      <w:spacing w:after="0" w:line="240" w:lineRule="auto"/>
+    </w:pPr>
+  </w:style>
+  <w:style w:type="character" w:customStyle="1" w:styleId="FooterChar">
+    <w:name w:val="Footer Char"/>
+    <w:basedOn w:val="DefaultParagraphFont"/>
+    <w:link w:val="Footer"/>
+    <w:uiPriority w:val="99"/>
+    <w:rsid w:val="00F15B93"/>
   </w:style>
 </w:styles>
 </file>

</xml_diff>